<commit_message>
Week 2 submission, last minute changes.
</commit_message>
<xml_diff>
--- a/00_Project_Administration/Ethical_Clearance_Confirmation.docx
+++ b/00_Project_Administration/Ethical_Clearance_Confirmation.docx
@@ -103,13 +103,8 @@
           </w:tcPr>
           <w:p>
             <w:r>
-              <w:t xml:space="preserve">Willem Basson, Dylan Shepard, Moegammad Green, Sihle </w:t>
+              <w:t>Willem Basson, Dylan Shepard, Moegammad Green, Sihle Kayise</w:t>
             </w:r>
-            <w:proofErr w:type="spellStart"/>
-            <w:r>
-              <w:t>Kayise</w:t>
-            </w:r>
-            <w:proofErr w:type="spellEnd"/>
           </w:p>
         </w:tc>
       </w:tr>
@@ -160,13 +155,8 @@
           </w:tcPr>
           <w:p>
             <w:r>
-              <w:t xml:space="preserve">Amenda </w:t>
+              <w:t>Amenda Raganya</w:t>
             </w:r>
-            <w:proofErr w:type="spellStart"/>
-            <w:r>
-              <w:t>Raganya</w:t>
-            </w:r>
-            <w:proofErr w:type="spellEnd"/>
           </w:p>
         </w:tc>
       </w:tr>
@@ -277,11 +267,9 @@
       <w:r>
         <w:t xml:space="preserve">Explain consent, privacy, confidentiality, secure data handling and </w:t>
       </w:r>
-      <w:proofErr w:type="spellStart"/>
       <w:r>
-        <w:t>minimisation</w:t>
+        <w:t>minimization</w:t>
       </w:r>
-      <w:proofErr w:type="spellEnd"/>
       <w:r>
         <w:t>.</w:t>
       </w:r>
@@ -1330,6 +1318,7 @@
   <w:style w:type="character" w:default="1" w:styleId="DefaultParagraphFont">
     <w:name w:val="Default Paragraph Font"/>
     <w:uiPriority w:val="1"/>
+    <w:semiHidden/>
     <w:unhideWhenUsed/>
   </w:style>
   <w:style w:type="table" w:default="1" w:styleId="TableNormal">

</xml_diff>